<commit_message>
feat: add documentation for synthesized fields in Danh_Sach_Truong_Tong_Hop.md
</commit_message>
<xml_diff>
--- a/backend-app/samples/FILE MAU HOP DONG CÒN LẠI/3.1 MAU HDONG - 0406 (HỘI NGHỊ + TIỆC-TEABREAK).docx
+++ b/backend-app/samples/FILE MAU HOP DONG CÒN LẠI/3.1 MAU HDONG - 0406 (HỘI NGHỊ + TIỆC-TEABREAK).docx
@@ -456,10 +456,11 @@
         <w:spacing w:line="360" w:lineRule="auto"/>
         <w:ind w:left="320" w:leftChars="100"/>
         <w:rPr>
-          <w:rFonts w:ascii="Times New Roman" w:hAnsi="Times New Roman"/>
-          <w:b/>
-          <w:sz w:val="26"/>
-          <w:szCs w:val="26"/>
+          <w:rFonts w:hint="default" w:ascii="Times New Roman" w:hAnsi="Times New Roman"/>
+          <w:b/>
+          <w:sz w:val="26"/>
+          <w:szCs w:val="26"/>
+          <w:lang w:val="en-US"/>
         </w:rPr>
       </w:pPr>
       <w:r>
@@ -491,22 +492,13 @@
       </w:r>
       <w:r>
         <w:rPr>
-          <w:rFonts w:ascii="Times New Roman" w:hAnsi="Times New Roman"/>
-          <w:b/>
-          <w:sz w:val="26"/>
-          <w:szCs w:val="26"/>
-          <w:lang w:val="fr-FR"/>
-        </w:rPr>
-        <w:t xml:space="preserve">CÔNG TY TNHH </w:t>
-      </w:r>
-      <w:r>
-        <w:rPr>
-          <w:rFonts w:ascii="Times New Roman" w:hAnsi="Times New Roman"/>
-          <w:b/>
-          <w:sz w:val="26"/>
-          <w:szCs w:val="26"/>
-        </w:rPr>
-        <w:t>GIẢI TRÍ HOÀNG HẢI</w:t>
+          <w:rFonts w:hint="default" w:ascii="Times New Roman" w:hAnsi="Times New Roman"/>
+          <w:b/>
+          <w:sz w:val="26"/>
+          <w:szCs w:val="26"/>
+          <w:lang w:val="en-US"/>
+        </w:rPr>
+        <w:t>{BenATenCongTy}</w:t>
       </w:r>
     </w:p>
     <w:p>
@@ -515,10 +507,11 @@
         <w:spacing w:line="360" w:lineRule="auto"/>
         <w:ind w:left="320" w:leftChars="100"/>
         <w:rPr>
-          <w:rFonts w:ascii="Times New Roman" w:hAnsi="Times New Roman"/>
-          <w:b/>
-          <w:sz w:val="26"/>
-          <w:szCs w:val="26"/>
+          <w:rFonts w:hint="default" w:ascii="Times New Roman" w:hAnsi="Times New Roman"/>
+          <w:b/>
+          <w:sz w:val="26"/>
+          <w:szCs w:val="26"/>
+          <w:lang w:val="en-US"/>
         </w:rPr>
       </w:pPr>
       <w:bookmarkStart w:id="0" w:name="_Hlk135660413"/>
@@ -550,12 +543,13 @@
       </w:r>
       <w:r>
         <w:rPr>
-          <w:rFonts w:ascii="Times New Roman" w:hAnsi="Times New Roman"/>
-          <w:b/>
-          <w:sz w:val="26"/>
-          <w:szCs w:val="26"/>
-        </w:rPr>
-        <w:t>Ông</w:t>
+          <w:rFonts w:hint="default" w:ascii="Times New Roman" w:hAnsi="Times New Roman"/>
+          <w:b/>
+          <w:sz w:val="26"/>
+          <w:szCs w:val="26"/>
+          <w:lang w:val="en-US"/>
+        </w:rPr>
+        <w:t>{HNNguoiDaiDien}</w:t>
       </w:r>
     </w:p>
     <w:p>
@@ -564,9 +558,10 @@
         <w:spacing w:line="360" w:lineRule="auto"/>
         <w:ind w:left="320" w:leftChars="100"/>
         <w:rPr>
-          <w:rFonts w:ascii="Times New Roman" w:hAnsi="Times New Roman"/>
-          <w:sz w:val="26"/>
-          <w:szCs w:val="26"/>
+          <w:rFonts w:hint="default" w:ascii="Times New Roman" w:hAnsi="Times New Roman"/>
+          <w:sz w:val="26"/>
+          <w:szCs w:val="26"/>
+          <w:lang w:val="en-US"/>
         </w:rPr>
       </w:pPr>
       <w:bookmarkStart w:id="1" w:name="_Hlk164419968"/>
@@ -597,11 +592,12 @@
       </w:r>
       <w:r>
         <w:rPr>
-          <w:rFonts w:ascii="Times New Roman" w:hAnsi="Times New Roman"/>
-          <w:sz w:val="26"/>
-          <w:szCs w:val="26"/>
-        </w:rPr>
-        <w:t>Giám Đốc</w:t>
+          <w:rFonts w:hint="default" w:ascii="Times New Roman" w:hAnsi="Times New Roman"/>
+          <w:sz w:val="26"/>
+          <w:szCs w:val="26"/>
+          <w:lang w:val="en-US"/>
+        </w:rPr>
+        <w:t>{HNChucVuNguoiDaiDien}</w:t>
       </w:r>
     </w:p>
     <w:bookmarkEnd w:id="0"/>
@@ -612,9 +608,10 @@
         <w:spacing w:line="360" w:lineRule="auto"/>
         <w:ind w:left="320" w:leftChars="100"/>
         <w:rPr>
-          <w:rFonts w:ascii="Times New Roman" w:hAnsi="Times New Roman"/>
-          <w:sz w:val="26"/>
-          <w:szCs w:val="26"/>
+          <w:rFonts w:hint="default" w:ascii="Times New Roman" w:hAnsi="Times New Roman"/>
+          <w:sz w:val="26"/>
+          <w:szCs w:val="26"/>
+          <w:lang w:val="en-US"/>
         </w:rPr>
       </w:pPr>
       <w:r>
@@ -643,11 +640,12 @@
       </w:r>
       <w:r>
         <w:rPr>
-          <w:rFonts w:ascii="Times New Roman" w:hAnsi="Times New Roman"/>
-          <w:sz w:val="26"/>
-          <w:szCs w:val="26"/>
-        </w:rPr>
-        <w:t>16A Lê Hồng Phong (nối dài), Phường Hoà Hưng, Tp.HCM</w:t>
+          <w:rFonts w:hint="default" w:ascii="Times New Roman" w:hAnsi="Times New Roman"/>
+          <w:sz w:val="26"/>
+          <w:szCs w:val="26"/>
+          <w:lang w:val="en-US"/>
+        </w:rPr>
+        <w:t>{BenADiaChi}</w:t>
       </w:r>
     </w:p>
     <w:p>
@@ -656,9 +654,10 @@
         <w:spacing w:line="360" w:lineRule="auto"/>
         <w:ind w:left="320" w:leftChars="100"/>
         <w:rPr>
-          <w:rFonts w:ascii="Times New Roman" w:hAnsi="Times New Roman"/>
-          <w:sz w:val="26"/>
-          <w:szCs w:val="26"/>
+          <w:rFonts w:hint="default" w:ascii="Times New Roman" w:hAnsi="Times New Roman"/>
+          <w:sz w:val="26"/>
+          <w:szCs w:val="26"/>
+          <w:lang w:val="en-US"/>
         </w:rPr>
       </w:pPr>
       <w:r>
@@ -687,11 +686,29 @@
       </w:r>
       <w:r>
         <w:rPr>
-          <w:rFonts w:ascii="Times New Roman" w:hAnsi="Times New Roman"/>
-          <w:sz w:val="26"/>
-          <w:szCs w:val="26"/>
-        </w:rPr>
-        <w:t>(+8428) 38 628 899</w:t>
+          <w:rFonts w:hint="default" w:ascii="Times New Roman" w:hAnsi="Times New Roman"/>
+          <w:sz w:val="26"/>
+          <w:szCs w:val="26"/>
+          <w:lang w:val="en-US"/>
+        </w:rPr>
+        <w:t>{</w:t>
+      </w:r>
+      <w:r>
+        <w:rPr>
+          <w:rFonts w:hint="default" w:ascii="Times New Roman" w:hAnsi="Times New Roman"/>
+          <w:sz w:val="26"/>
+          <w:szCs w:val="26"/>
+        </w:rPr>
+        <w:t>BenASDT</w:t>
+      </w:r>
+      <w:r>
+        <w:rPr>
+          <w:rFonts w:hint="default" w:ascii="Times New Roman" w:hAnsi="Times New Roman"/>
+          <w:sz w:val="26"/>
+          <w:szCs w:val="26"/>
+          <w:lang w:val="en-US"/>
+        </w:rPr>
+        <w:t>}</w:t>
       </w:r>
     </w:p>
     <w:p>
@@ -700,9 +717,10 @@
         <w:spacing w:line="360" w:lineRule="auto"/>
         <w:ind w:left="320" w:leftChars="100"/>
         <w:rPr>
-          <w:rFonts w:ascii="Times New Roman" w:hAnsi="Times New Roman"/>
-          <w:sz w:val="26"/>
-          <w:szCs w:val="26"/>
+          <w:rFonts w:hint="default" w:ascii="Times New Roman" w:hAnsi="Times New Roman"/>
+          <w:sz w:val="26"/>
+          <w:szCs w:val="26"/>
+          <w:lang w:val="en-US"/>
         </w:rPr>
       </w:pPr>
       <w:r>
@@ -731,11 +749,12 @@
       </w:r>
       <w:r>
         <w:rPr>
-          <w:rFonts w:ascii="Times New Roman" w:hAnsi="Times New Roman"/>
-          <w:sz w:val="26"/>
-          <w:szCs w:val="26"/>
-        </w:rPr>
-        <w:t>0316707853</w:t>
+          <w:rFonts w:hint="default" w:ascii="Times New Roman" w:hAnsi="Times New Roman"/>
+          <w:sz w:val="26"/>
+          <w:szCs w:val="26"/>
+          <w:lang w:val="en-US"/>
+        </w:rPr>
+        <w:t>{BenAMST}</w:t>
       </w:r>
     </w:p>
     <w:p>
@@ -1209,6 +1228,7 @@
           <w:lang w:eastAsia="zh-CN" w:bidi="ar"/>
         </w:rPr>
       </w:pPr>
+      <w:bookmarkStart w:id="2" w:name="_GoBack"/>
       <w:r>
         <w:rPr>
           <w:rFonts w:ascii="Times New Roman" w:hAnsi="Times New Roman" w:eastAsia="SimSun"/>
@@ -1304,6 +1324,7 @@
         <w:t>khách</w:t>
       </w:r>
     </w:p>
+    <w:bookmarkEnd w:id="2"/>
     <w:p>
       <w:pPr>
         <w:shd w:val="clear" w:color="auto" w:fill="FFFFFF" w:themeFill="background1"/>
@@ -3938,8 +3959,6 @@
         </w:rPr>
         <w:t>{MucPhiPhucVu}</w:t>
       </w:r>
-      <w:bookmarkStart w:id="2" w:name="_GoBack"/>
-      <w:bookmarkEnd w:id="2"/>
       <w:r>
         <w:rPr>
           <w:rFonts w:ascii="Times New Roman" w:hAnsi="Times New Roman" w:eastAsia="TimesNewRomanPS-BoldMT"/>
@@ -6323,7 +6342,7 @@
           <w:szCs w:val="26"/>
           <w:lang w:val="en-US" w:eastAsia="zh-CN" w:bidi="ar"/>
         </w:rPr>
-        <w:t xml:space="preserve"> {BenB_TenChuTiec}</w:t>
+        <w:t xml:space="preserve"> {BenBTenChuTiec}</w:t>
       </w:r>
       <w:r>
         <w:rPr>
@@ -6399,7 +6418,7 @@
           <w:szCs w:val="26"/>
           <w:lang w:eastAsia="zh-CN" w:bidi="ar"/>
         </w:rPr>
-        <w:t>{BenB_TenChuTiec}</w:t>
+        <w:t>{BenBTenChuTiec}</w:t>
       </w:r>
       <w:r>
         <w:rPr>

</xml_diff>